<commit_message>
Add explicit 40% ZeroPay / 20% BETONIQ WEST equity offer to Kwati JV Heads of Terms Section 6
</commit_message>
<xml_diff>
--- a/documents_aug2026/KWATI_JV_HEADS_OF_TERMS_Aug2026.docx
+++ b/documents_aug2026/KWATI_JV_HEADS_OF_TERMS_Aug2026.docx
@@ -763,6 +763,130 @@
         <w:t>In addition to the real estate JV structure above, this Heads of Terms also binds the parties to the ZerôPâŷ Money fintech investment described in the companion Full Fintech Offer document. Total cash ask: $500,000 for the Niger State proof-of-concept phase, released in three tranches gated to specific, verifiable milestones rather than as a single lump sum.</w:t>
       </w:r>
     </w:p>
+    <w:p>
+      <w:pPr>
+        <w:spacing w:before="120" w:after="120"/>
+      </w:pPr>
+      <w:r>
+        <w:rPr>
+          <w:b/>
+          <w:color w:val="B00020"/>
+          <w:sz w:val="22"/>
+        </w:rPr>
+        <w:t>EQUITY OFFER — INCENTIVE FOR KWATI GROUP'S BUY-IN TO ZERÔPÂŶ MONEY</w:t>
+      </w:r>
+    </w:p>
+    <w:p>
+      <w:pPr>
+        <w:spacing w:after="160"/>
+      </w:pPr>
+      <w:r>
+        <w:rPr>
+          <w:b w:val="0"/>
+          <w:i w:val="0"/>
+          <w:color w:val="111111"/>
+          <w:sz w:val="21"/>
+        </w:rPr>
+        <w:t>As additional incentive for Kwati Group to commit the $500,000 investment described in this Section 6, BETONIQ WEST LTD offers Wisdom Kwati / Kwati Group the following equity holding, conditional on completion of that investment:</w:t>
+      </w:r>
+    </w:p>
+    <w:tbl>
+      <w:tblPr>
+        <w:tblStyle w:val="TableGrid"/>
+        <w:tblW w:type="auto" w:w="0"/>
+        <w:tblLook w:firstColumn="1" w:firstRow="1" w:lastColumn="0" w:lastRow="0" w:noHBand="0" w:noVBand="1" w:val="04A0"/>
+      </w:tblPr>
+      <w:tblGrid>
+        <w:gridCol w:w="4873"/>
+        <w:gridCol w:w="4873"/>
+      </w:tblGrid>
+      <w:tr>
+        <w:tc>
+          <w:tcPr>
+            <w:tcW w:type="dxa" w:w="4873"/>
+          </w:tcPr>
+          <w:p>
+            <w:r>
+              <w:rPr>
+                <w:b/>
+              </w:rPr>
+              <w:t>Equity Grant</w:t>
+            </w:r>
+          </w:p>
+        </w:tc>
+        <w:tc>
+          <w:tcPr>
+            <w:tcW w:type="dxa" w:w="4873"/>
+          </w:tcPr>
+          <w:p>
+            <w:r>
+              <w:rPr>
+                <w:b/>
+              </w:rPr>
+              <w:t>Holding</w:t>
+            </w:r>
+          </w:p>
+        </w:tc>
+      </w:tr>
+      <w:tr>
+        <w:tc>
+          <w:tcPr>
+            <w:tcW w:type="dxa" w:w="4873"/>
+          </w:tcPr>
+          <w:p>
+            <w:r>
+              <w:t>ZerôPâŷ Money (operating technology subsidiary)</w:t>
+            </w:r>
+          </w:p>
+        </w:tc>
+        <w:tc>
+          <w:tcPr>
+            <w:tcW w:type="dxa" w:w="4873"/>
+          </w:tcPr>
+          <w:p>
+            <w:r>
+              <w:t>40% equity holding, with an accompanying Director-level board seat</w:t>
+            </w:r>
+          </w:p>
+        </w:tc>
+      </w:tr>
+      <w:tr>
+        <w:tc>
+          <w:tcPr>
+            <w:tcW w:type="dxa" w:w="4873"/>
+          </w:tcPr>
+          <w:p>
+            <w:r>
+              <w:t>BETONIQ WEST LTD (parent holding company)</w:t>
+            </w:r>
+          </w:p>
+        </w:tc>
+        <w:tc>
+          <w:tcPr>
+            <w:tcW w:type="dxa" w:w="4873"/>
+          </w:tcPr>
+          <w:p>
+            <w:r>
+              <w:t>20% equity holding</w:t>
+            </w:r>
+          </w:p>
+        </w:tc>
+      </w:tr>
+    </w:tbl>
+    <w:p>
+      <w:pPr>
+        <w:spacing w:after="160"/>
+      </w:pPr>
+      <w:r>
+        <w:rPr>
+          <w:b w:val="0"/>
+          <w:i/>
+          <w:color w:val="444444"/>
+          <w:sz w:val="19"/>
+        </w:rPr>
+        <w:t>This equity holding is granted specifically as an incentive for Kwati Group's buy-in to ZerôPâŷ Money and sits alongside, not in place of, the real estate JV equity structure set out in Section 3. Final equity documentation (share subscription agreement, board seat terms) will be formalised as part of the binding JV Agreement referenced in Section 5.</w:t>
+      </w:r>
+    </w:p>
     <w:tbl>
       <w:tblPr>
         <w:tblStyle w:val="TableGrid"/>

</xml_diff>